<commit_message>
Actualización de Guías de Usuarios Parte 1
Actualización de Guías de Usuarios Parte 1
</commit_message>
<xml_diff>
--- a/PPAFE/16 GUIAS DE USUARIO/Participaciones y Aportaciones Federales y Estatales - AportaEstatales Memorias Calculo.docx
+++ b/PPAFE/16 GUIAS DE USUARIO/Participaciones y Aportaciones Federales y Estatales - AportaEstatales Memorias Calculo.docx
@@ -123,7 +123,7 @@
           <w:lang w:val="es-MX" w:eastAsia="es-MX"/>
         </w:rPr>
         <w:drawing>
-          <wp:anchor distT="0" distB="0" distL="114300" distR="114300" simplePos="0" relativeHeight="251805696" behindDoc="0" locked="0" layoutInCell="1" allowOverlap="1" wp14:anchorId="6F593B06" wp14:editId="4081F1B2">
+          <wp:anchor distT="0" distB="0" distL="114300" distR="114300" simplePos="0" relativeHeight="251805696" behindDoc="0" locked="0" layoutInCell="1" allowOverlap="1" wp14:anchorId="6F593B06" wp14:editId="61796FAA">
             <wp:simplePos x="0" y="0"/>
             <wp:positionH relativeFrom="margin">
               <wp:posOffset>673617</wp:posOffset>
@@ -1235,7 +1235,7 @@
             </w:rPr>
             <w:fldChar w:fldCharType="separate"/>
           </w:r>
-          <w:hyperlink w:anchor="_Toc200103426" w:history="1">
+          <w:hyperlink w:anchor="_Toc214383634" w:history="1">
             <w:r>
               <w:rPr>
                 <w:rStyle w:val="Hyperlink"/>
@@ -1258,7 +1258,7 @@
               <w:rPr>
                 <w:webHidden/>
               </w:rPr>
-              <w:instrText xml:space="preserve"> PAGEREF _Toc200103426 \h </w:instrText>
+              <w:instrText xml:space="preserve"> PAGEREF _Toc214383634 \h </w:instrText>
             </w:r>
             <w:r>
               <w:rPr>
@@ -1297,7 +1297,7 @@
               <w14:ligatures w14:val="standardContextual"/>
             </w:rPr>
           </w:pPr>
-          <w:hyperlink w:anchor="_Toc200103427" w:history="1">
+          <w:hyperlink w:anchor="_Toc214383635" w:history="1">
             <w:r>
               <w:rPr>
                 <w:rStyle w:val="Hyperlink"/>
@@ -1320,7 +1320,7 @@
               <w:rPr>
                 <w:webHidden/>
               </w:rPr>
-              <w:instrText xml:space="preserve"> PAGEREF _Toc200103427 \h </w:instrText>
+              <w:instrText xml:space="preserve"> PAGEREF _Toc214383635 \h </w:instrText>
             </w:r>
             <w:r>
               <w:rPr>
@@ -1359,7 +1359,7 @@
               <w14:ligatures w14:val="standardContextual"/>
             </w:rPr>
           </w:pPr>
-          <w:hyperlink w:anchor="_Toc200103428" w:history="1">
+          <w:hyperlink w:anchor="_Toc214383636" w:history="1">
             <w:r>
               <w:rPr>
                 <w:rStyle w:val="Hyperlink"/>
@@ -1382,7 +1382,7 @@
               <w:rPr>
                 <w:webHidden/>
               </w:rPr>
-              <w:instrText xml:space="preserve"> PAGEREF _Toc200103428 \h </w:instrText>
+              <w:instrText xml:space="preserve"> PAGEREF _Toc214383636 \h </w:instrText>
             </w:r>
             <w:r>
               <w:rPr>
@@ -1421,7 +1421,7 @@
               <w14:ligatures w14:val="standardContextual"/>
             </w:rPr>
           </w:pPr>
-          <w:hyperlink w:anchor="_Toc200103429" w:history="1">
+          <w:hyperlink w:anchor="_Toc214383637" w:history="1">
             <w:r>
               <w:rPr>
                 <w:rStyle w:val="Hyperlink"/>
@@ -1445,7 +1445,7 @@
               <w:rPr>
                 <w:webHidden/>
               </w:rPr>
-              <w:instrText xml:space="preserve"> PAGEREF _Toc200103429 \h </w:instrText>
+              <w:instrText xml:space="preserve"> PAGEREF _Toc214383637 \h </w:instrText>
             </w:r>
             <w:r>
               <w:rPr>
@@ -1484,7 +1484,7 @@
               <w14:ligatures w14:val="standardContextual"/>
             </w:rPr>
           </w:pPr>
-          <w:hyperlink w:anchor="_Toc200103430" w:history="1">
+          <w:hyperlink w:anchor="_Toc214383638" w:history="1">
             <w:r>
               <w:rPr>
                 <w:rStyle w:val="Hyperlink"/>
@@ -1508,7 +1508,7 @@
               <w:rPr>
                 <w:webHidden/>
               </w:rPr>
-              <w:instrText xml:space="preserve"> PAGEREF _Toc200103430 \h </w:instrText>
+              <w:instrText xml:space="preserve"> PAGEREF _Toc214383638 \h </w:instrText>
             </w:r>
             <w:r>
               <w:rPr>
@@ -1547,7 +1547,7 @@
               <w14:ligatures w14:val="standardContextual"/>
             </w:rPr>
           </w:pPr>
-          <w:hyperlink w:anchor="_Toc200103431" w:history="1">
+          <w:hyperlink w:anchor="_Toc214383639" w:history="1">
             <w:r>
               <w:rPr>
                 <w:rStyle w:val="Hyperlink"/>
@@ -1570,7 +1570,7 @@
               <w:rPr>
                 <w:webHidden/>
               </w:rPr>
-              <w:instrText xml:space="preserve"> PAGEREF _Toc200103431 \h </w:instrText>
+              <w:instrText xml:space="preserve"> PAGEREF _Toc214383639 \h </w:instrText>
             </w:r>
             <w:r>
               <w:rPr>
@@ -1609,7 +1609,7 @@
               <w14:ligatures w14:val="standardContextual"/>
             </w:rPr>
           </w:pPr>
-          <w:hyperlink w:anchor="_Toc200103432" w:history="1">
+          <w:hyperlink w:anchor="_Toc214383640" w:history="1">
             <w:r>
               <w:rPr>
                 <w:rStyle w:val="Hyperlink"/>
@@ -1632,7 +1632,7 @@
               <w:rPr>
                 <w:webHidden/>
               </w:rPr>
-              <w:instrText xml:space="preserve"> PAGEREF _Toc200103432 \h </w:instrText>
+              <w:instrText xml:space="preserve"> PAGEREF _Toc214383640 \h </w:instrText>
             </w:r>
             <w:r>
               <w:rPr>
@@ -1671,7 +1671,7 @@
               <w14:ligatures w14:val="standardContextual"/>
             </w:rPr>
           </w:pPr>
-          <w:hyperlink w:anchor="_Toc200103433" w:history="1">
+          <w:hyperlink w:anchor="_Toc214383641" w:history="1">
             <w:r>
               <w:rPr>
                 <w:rStyle w:val="Hyperlink"/>
@@ -1694,7 +1694,7 @@
               <w:rPr>
                 <w:webHidden/>
               </w:rPr>
-              <w:instrText xml:space="preserve"> PAGEREF _Toc200103433 \h </w:instrText>
+              <w:instrText xml:space="preserve"> PAGEREF _Toc214383641 \h </w:instrText>
             </w:r>
             <w:r>
               <w:rPr>
@@ -1711,7 +1711,7 @@
               <w:rPr>
                 <w:webHidden/>
               </w:rPr>
-              <w:t>10</w:t>
+              <w:t>11</w:t>
             </w:r>
             <w:r>
               <w:rPr>
@@ -1733,7 +1733,7 @@
               <w14:ligatures w14:val="standardContextual"/>
             </w:rPr>
           </w:pPr>
-          <w:hyperlink w:anchor="_Toc200103434" w:history="1">
+          <w:hyperlink w:anchor="_Toc214383642" w:history="1">
             <w:r>
               <w:rPr>
                 <w:rStyle w:val="Hyperlink"/>
@@ -1756,7 +1756,7 @@
               <w:rPr>
                 <w:webHidden/>
               </w:rPr>
-              <w:instrText xml:space="preserve"> PAGEREF _Toc200103434 \h </w:instrText>
+              <w:instrText xml:space="preserve"> PAGEREF _Toc214383642 \h </w:instrText>
             </w:r>
             <w:r>
               <w:rPr>
@@ -1773,7 +1773,7 @@
               <w:rPr>
                 <w:webHidden/>
               </w:rPr>
-              <w:t>12</w:t>
+              <w:t>13</w:t>
             </w:r>
             <w:r>
               <w:rPr>
@@ -1795,12 +1795,12 @@
               <w14:ligatures w14:val="standardContextual"/>
             </w:rPr>
           </w:pPr>
-          <w:hyperlink w:anchor="_Toc200103435" w:history="1">
+          <w:hyperlink w:anchor="_Toc214383643" w:history="1">
             <w:r>
               <w:rPr>
                 <w:rStyle w:val="Hyperlink"/>
               </w:rPr>
-              <w:t>5.- Consulta de estatus</w:t>
+              <w:t>5.- Para eliminar los datos registrados de Aportaciones Estatales – Memorias de Cálculo</w:t>
             </w:r>
             <w:r>
               <w:rPr>
@@ -1818,7 +1818,7 @@
               <w:rPr>
                 <w:webHidden/>
               </w:rPr>
-              <w:instrText xml:space="preserve"> PAGEREF _Toc200103435 \h </w:instrText>
+              <w:instrText xml:space="preserve"> PAGEREF _Toc214383643 \h </w:instrText>
             </w:r>
             <w:r>
               <w:rPr>
@@ -1835,7 +1835,69 @@
               <w:rPr>
                 <w:webHidden/>
               </w:rPr>
-              <w:t>14</w:t>
+              <w:t>15</w:t>
+            </w:r>
+            <w:r>
+              <w:rPr>
+                <w:webHidden/>
+              </w:rPr>
+              <w:fldChar w:fldCharType="end"/>
+            </w:r>
+          </w:hyperlink>
+        </w:p>
+        <w:p>
+          <w:pPr>
+            <w:pStyle w:val="TOC1"/>
+            <w:rPr>
+              <w:rFonts w:eastAsiaTheme="minorEastAsia" w:cstheme="minorBidi"/>
+              <w:kern w:val="2"/>
+              <w:sz w:val="24"/>
+              <w:szCs w:val="24"/>
+              <w:lang w:val="en-MX"/>
+              <w14:ligatures w14:val="standardContextual"/>
+            </w:rPr>
+          </w:pPr>
+          <w:hyperlink w:anchor="_Toc214383644" w:history="1">
+            <w:r>
+              <w:rPr>
+                <w:rStyle w:val="Hyperlink"/>
+              </w:rPr>
+              <w:t>6.- Consulta de estatus</w:t>
+            </w:r>
+            <w:r>
+              <w:rPr>
+                <w:webHidden/>
+              </w:rPr>
+              <w:tab/>
+            </w:r>
+            <w:r>
+              <w:rPr>
+                <w:webHidden/>
+              </w:rPr>
+              <w:fldChar w:fldCharType="begin"/>
+            </w:r>
+            <w:r>
+              <w:rPr>
+                <w:webHidden/>
+              </w:rPr>
+              <w:instrText xml:space="preserve"> PAGEREF _Toc214383644 \h </w:instrText>
+            </w:r>
+            <w:r>
+              <w:rPr>
+                <w:webHidden/>
+              </w:rPr>
+            </w:r>
+            <w:r>
+              <w:rPr>
+                <w:webHidden/>
+              </w:rPr>
+              <w:fldChar w:fldCharType="separate"/>
+            </w:r>
+            <w:r>
+              <w:rPr>
+                <w:webHidden/>
+              </w:rPr>
+              <w:t>17</w:t>
             </w:r>
             <w:r>
               <w:rPr>
@@ -2725,7 +2787,7 @@
         </w:rPr>
       </w:pPr>
       <w:bookmarkStart w:id="0" w:name="_Toc123297018"/>
-      <w:bookmarkStart w:id="1" w:name="_Toc200103426"/>
+      <w:bookmarkStart w:id="1" w:name="_Toc214383634"/>
       <w:r>
         <w:rPr>
           <w:rFonts w:cs="Arial"/>
@@ -2900,7 +2962,7 @@
         </w:rPr>
       </w:pPr>
       <w:bookmarkStart w:id="2" w:name="_Toc123297019"/>
-      <w:bookmarkStart w:id="3" w:name="_Toc200103427"/>
+      <w:bookmarkStart w:id="3" w:name="_Toc214383635"/>
       <w:r>
         <w:rPr>
           <w:rFonts w:cs="Arial"/>
@@ -3056,7 +3118,7 @@
         </w:rPr>
       </w:pPr>
       <w:bookmarkStart w:id="4" w:name="_Toc123297020"/>
-      <w:bookmarkStart w:id="5" w:name="_Toc200103428"/>
+      <w:bookmarkStart w:id="5" w:name="_Toc214383636"/>
       <w:r>
         <w:rPr>
           <w:rFonts w:cs="Arial"/>
@@ -3273,7 +3335,7 @@
           <w:szCs w:val="44"/>
         </w:rPr>
       </w:pPr>
-      <w:bookmarkStart w:id="6" w:name="_Toc200103429"/>
+      <w:bookmarkStart w:id="6" w:name="_Toc214383637"/>
       <w:r>
         <w:rPr>
           <w:rFonts w:cs="Arial"/>
@@ -3366,7 +3428,7 @@
           <w:szCs w:val="44"/>
         </w:rPr>
       </w:pPr>
-      <w:bookmarkStart w:id="7" w:name="_Toc200103430"/>
+      <w:bookmarkStart w:id="7" w:name="_Toc214383638"/>
       <w:r>
         <w:rPr>
           <w:rFonts w:cs="Arial"/>
@@ -3547,7 +3609,7 @@
       </w:pPr>
       <w:bookmarkStart w:id="8" w:name="_Toc123565162"/>
       <w:bookmarkStart w:id="9" w:name="_Toc124341669"/>
-      <w:bookmarkStart w:id="10" w:name="_Toc200103431"/>
+      <w:bookmarkStart w:id="10" w:name="_Toc214383639"/>
       <w:r>
         <w:rPr>
           <w:rFonts w:cs="Arial"/>
@@ -4173,7 +4235,7 @@
       </w:pPr>
       <w:bookmarkStart w:id="11" w:name="_Toc123565163"/>
       <w:bookmarkStart w:id="12" w:name="_Toc124341670"/>
-      <w:bookmarkStart w:id="13" w:name="_Toc200103432"/>
+      <w:bookmarkStart w:id="13" w:name="_Toc214383640"/>
       <w:r>
         <w:rPr>
           <w:rFonts w:cs="Arial"/>
@@ -4447,7 +4509,7 @@
           <w:lang w:val="es-MX" w:eastAsia="es-MX"/>
         </w:rPr>
         <w:drawing>
-          <wp:inline distT="0" distB="0" distL="0" distR="0" wp14:anchorId="412FF131" wp14:editId="799411F6">
+          <wp:inline distT="0" distB="0" distL="0" distR="0" wp14:anchorId="412FF131" wp14:editId="6A127759">
             <wp:extent cx="5400000" cy="2223422"/>
             <wp:effectExtent l="152400" t="152400" r="328295" b="342265"/>
             <wp:docPr id="547273814" name="Picture 1"/>
@@ -4699,24 +4761,14 @@
         </w:rPr>
         <w:t>, “</w:t>
       </w:r>
-      <w:proofErr w:type="spellStart"/>
-      <w:r>
-        <w:rPr>
-          <w:rFonts w:ascii="Arial" w:hAnsi="Arial" w:cs="Arial"/>
-          <w:sz w:val="24"/>
-          <w:szCs w:val="24"/>
-        </w:rPr>
-        <w:t>Ad</w:t>
-      </w:r>
-      <w:r>
-        <w:rPr>
-          <w:rFonts w:ascii="Arial" w:hAnsi="Arial" w:cs="Arial"/>
-          <w:sz w:val="24"/>
-          <w:szCs w:val="24"/>
-        </w:rPr>
-        <w:t>d</w:t>
-      </w:r>
-      <w:proofErr w:type="spellEnd"/>
+      <w:r>
+        <w:rPr>
+          <w:rFonts w:ascii="Arial" w:hAnsi="Arial" w:cs="Arial"/>
+          <w:sz w:val="24"/>
+          <w:szCs w:val="24"/>
+        </w:rPr>
+        <w:t>Agregar</w:t>
+      </w:r>
       <w:r>
         <w:rPr>
           <w:rFonts w:ascii="Arial" w:hAnsi="Arial" w:cs="Arial"/>
@@ -4979,7 +5031,7 @@
           <w:lang w:val="es-MX" w:eastAsia="es-MX"/>
         </w:rPr>
         <w:drawing>
-          <wp:inline distT="0" distB="0" distL="0" distR="0" wp14:anchorId="57FC2FCD" wp14:editId="6E2C176F">
+          <wp:inline distT="0" distB="0" distL="0" distR="0" wp14:anchorId="57FC2FCD" wp14:editId="7EF7234F">
             <wp:extent cx="5400000" cy="1301426"/>
             <wp:effectExtent l="152400" t="152400" r="340995" b="337185"/>
             <wp:docPr id="1125371239" name="Picture 2"/>
@@ -5136,7 +5188,7 @@
           <w:lang w:val="es-MX" w:eastAsia="es-MX"/>
         </w:rPr>
         <w:drawing>
-          <wp:inline distT="0" distB="0" distL="0" distR="0" wp14:anchorId="102CE162" wp14:editId="4607AA71">
+          <wp:inline distT="0" distB="0" distL="0" distR="0" wp14:anchorId="102CE162" wp14:editId="4F8A1291">
             <wp:extent cx="2093089" cy="2277745"/>
             <wp:effectExtent l="152400" t="152400" r="332740" b="338455"/>
             <wp:docPr id="2003773544" name="Picture 1"/>
@@ -5226,16 +5278,14 @@
         </w:rPr>
         <w:t>2.3 “</w:t>
       </w:r>
-      <w:proofErr w:type="spellStart"/>
-      <w:r>
-        <w:rPr>
-          <w:rFonts w:ascii="Arial" w:hAnsi="Arial" w:cs="Arial"/>
-          <w:sz w:val="24"/>
-          <w:szCs w:val="24"/>
-        </w:rPr>
-        <w:t>Add</w:t>
-      </w:r>
-      <w:proofErr w:type="spellEnd"/>
+      <w:r>
+        <w:rPr>
+          <w:rFonts w:ascii="Arial" w:hAnsi="Arial" w:cs="Arial"/>
+          <w:sz w:val="24"/>
+          <w:szCs w:val="24"/>
+        </w:rPr>
+        <w:t>Agregar</w:t>
+      </w:r>
       <w:r>
         <w:rPr>
           <w:rFonts w:ascii="Arial" w:hAnsi="Arial" w:cs="Arial"/>
@@ -5552,7 +5602,7 @@
           <w:szCs w:val="24"/>
         </w:rPr>
         <w:drawing>
-          <wp:inline distT="0" distB="0" distL="0" distR="0" wp14:anchorId="4E8DF856" wp14:editId="41E695A5">
+          <wp:inline distT="0" distB="0" distL="0" distR="0" wp14:anchorId="4E8DF856" wp14:editId="42A1AD81">
             <wp:extent cx="5400000" cy="2431161"/>
             <wp:effectExtent l="152400" t="152400" r="328295" b="337820"/>
             <wp:docPr id="1424179283" name="Picture 5"/>
@@ -5697,7 +5747,7 @@
           <w:szCs w:val="24"/>
         </w:rPr>
         <w:drawing>
-          <wp:inline distT="0" distB="0" distL="0" distR="0" wp14:anchorId="3D9B6C9A" wp14:editId="03CF4715">
+          <wp:inline distT="0" distB="0" distL="0" distR="0" wp14:anchorId="3D9B6C9A" wp14:editId="662F60CE">
             <wp:extent cx="5612130" cy="2538095"/>
             <wp:effectExtent l="152400" t="152400" r="344170" b="344805"/>
             <wp:docPr id="2145328129" name="Picture 7"/>
@@ -5842,7 +5892,7 @@
           <w:lang w:val="es-MX" w:eastAsia="es-MX"/>
         </w:rPr>
         <w:drawing>
-          <wp:inline distT="0" distB="0" distL="0" distR="0" wp14:anchorId="48EA61A7" wp14:editId="5A3A25F6">
+          <wp:inline distT="0" distB="0" distL="0" distR="0" wp14:anchorId="48EA61A7" wp14:editId="6FE2ADB8">
             <wp:extent cx="5400000" cy="2280244"/>
             <wp:effectExtent l="152400" t="152400" r="328295" b="349250"/>
             <wp:docPr id="502554479" name="Picture 1"/>
@@ -6084,7 +6134,7 @@
           <w:lang w:val="es-MX" w:eastAsia="es-MX"/>
         </w:rPr>
         <w:drawing>
-          <wp:inline distT="0" distB="0" distL="0" distR="0" wp14:anchorId="1CDC1316" wp14:editId="3E08AEF1">
+          <wp:inline distT="0" distB="0" distL="0" distR="0" wp14:anchorId="1CDC1316" wp14:editId="26784B04">
             <wp:extent cx="5400000" cy="1301426"/>
             <wp:effectExtent l="152400" t="152400" r="340995" b="337185"/>
             <wp:docPr id="1545656037" name="Picture 2"/>
@@ -6294,7 +6344,7 @@
           <w:lang w:val="es-MX" w:eastAsia="es-MX"/>
         </w:rPr>
         <w:drawing>
-          <wp:inline distT="0" distB="0" distL="0" distR="0" wp14:anchorId="4AB72A50" wp14:editId="4BF13232">
+          <wp:inline distT="0" distB="0" distL="0" distR="0" wp14:anchorId="4AB72A50" wp14:editId="55F155E0">
             <wp:extent cx="5400000" cy="2223422"/>
             <wp:effectExtent l="152400" t="152400" r="328295" b="342265"/>
             <wp:docPr id="513886856" name="Picture 1"/>
@@ -6918,7 +6968,7 @@
       </w:pPr>
       <w:bookmarkStart w:id="14" w:name="_Toc123565164"/>
       <w:bookmarkStart w:id="15" w:name="_Toc124341671"/>
-      <w:bookmarkStart w:id="16" w:name="_Toc200103433"/>
+      <w:bookmarkStart w:id="16" w:name="_Toc214383641"/>
       <w:r>
         <w:rPr>
           <w:rFonts w:cs="Arial"/>
@@ -7183,7 +7233,7 @@
           <w:lang w:val="es-MX" w:eastAsia="es-MX"/>
         </w:rPr>
         <w:drawing>
-          <wp:inline distT="0" distB="0" distL="0" distR="0" wp14:anchorId="0FB47294" wp14:editId="7A1D2A6B">
+          <wp:inline distT="0" distB="0" distL="0" distR="0" wp14:anchorId="0FB47294" wp14:editId="50E4006E">
             <wp:extent cx="5400000" cy="2223422"/>
             <wp:effectExtent l="152400" t="152400" r="328295" b="342265"/>
             <wp:docPr id="1165563267" name="Picture 1"/>
@@ -7348,7 +7398,7 @@
           <w:lang w:val="es-MX" w:eastAsia="es-MX"/>
         </w:rPr>
         <w:drawing>
-          <wp:inline distT="0" distB="0" distL="0" distR="0" wp14:anchorId="7AA4B4AD" wp14:editId="55AF381E">
+          <wp:inline distT="0" distB="0" distL="0" distR="0" wp14:anchorId="7AA4B4AD" wp14:editId="3EF4D033">
             <wp:extent cx="5612130" cy="2136140"/>
             <wp:effectExtent l="0" t="0" r="1270" b="0"/>
             <wp:docPr id="238151071" name="Picture 3"/>
@@ -7536,7 +7586,7 @@
           <w:sz w:val="24"/>
           <w:szCs w:val="24"/>
         </w:rPr>
-        <w:t>Aprobar</w:t>
+        <w:t>Validar</w:t>
       </w:r>
       <w:r>
         <w:rPr>
@@ -7571,7 +7621,7 @@
           <w:sz w:val="24"/>
           <w:szCs w:val="24"/>
         </w:rPr>
-        <w:t>Aprobar</w:t>
+        <w:t>Validar</w:t>
       </w:r>
       <w:r>
         <w:rPr>
@@ -7721,7 +7771,7 @@
           <w:lang w:val="es-MX" w:eastAsia="es-MX"/>
         </w:rPr>
         <w:drawing>
-          <wp:inline distT="0" distB="0" distL="0" distR="0" wp14:anchorId="3BD7EC40" wp14:editId="6D6FEE7D">
+          <wp:inline distT="0" distB="0" distL="0" distR="0" wp14:anchorId="3BD7EC40" wp14:editId="63EABA2A">
             <wp:extent cx="5400000" cy="2223422"/>
             <wp:effectExtent l="152400" t="152400" r="328295" b="342265"/>
             <wp:docPr id="930451410" name="Picture 1"/>
@@ -7809,7 +7859,7 @@
       </w:pPr>
       <w:bookmarkStart w:id="17" w:name="_Toc124161440"/>
       <w:bookmarkStart w:id="18" w:name="_Toc124341672"/>
-      <w:bookmarkStart w:id="19" w:name="_Toc200103434"/>
+      <w:bookmarkStart w:id="19" w:name="_Toc214383642"/>
       <w:r>
         <w:rPr>
           <w:rFonts w:cs="Arial"/>
@@ -7970,13 +8020,13 @@
         <mc:AlternateContent>
           <mc:Choice Requires="wps">
             <w:drawing>
-              <wp:anchor distT="0" distB="0" distL="114300" distR="114300" simplePos="0" relativeHeight="251854848" behindDoc="0" locked="0" layoutInCell="1" allowOverlap="1" wp14:anchorId="790D5566" wp14:editId="7E77856A">
+              <wp:anchor distT="0" distB="0" distL="114300" distR="114300" simplePos="0" relativeHeight="251854848" behindDoc="0" locked="0" layoutInCell="1" allowOverlap="1" wp14:anchorId="790D5566" wp14:editId="1AF3D54C">
                 <wp:simplePos x="0" y="0"/>
                 <wp:positionH relativeFrom="column">
-                  <wp:posOffset>360252</wp:posOffset>
+                  <wp:posOffset>331470</wp:posOffset>
                 </wp:positionH>
                 <wp:positionV relativeFrom="paragraph">
-                  <wp:posOffset>1191260</wp:posOffset>
+                  <wp:posOffset>976948</wp:posOffset>
                 </wp:positionV>
                 <wp:extent cx="152400" cy="114646"/>
                 <wp:effectExtent l="12700" t="12700" r="12700" b="12700"/>
@@ -8036,7 +8086,7 @@
           </mc:Choice>
           <mc:Fallback>
             <w:pict>
-              <v:rect w14:anchorId="0D331A9E" id="Rectángulo 44" o:spid="_x0000_s1026" style="position:absolute;margin-left:28.35pt;margin-top:93.8pt;width:12pt;height:9.05pt;z-index:251854848;visibility:visible;mso-wrap-style:square;mso-width-percent:0;mso-height-percent:0;mso-wrap-distance-left:9pt;mso-wrap-distance-top:0;mso-wrap-distance-right:9pt;mso-wrap-distance-bottom:0;mso-position-horizontal:absolute;mso-position-horizontal-relative:text;mso-position-vertical:absolute;mso-position-vertical-relative:text;mso-width-percent:0;mso-height-percent:0;mso-width-relative:margin;mso-height-relative:margin;v-text-anchor:middle" o:gfxdata="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" filled="f" strokecolor="red" strokeweight="2.25pt"/>
+              <v:rect w14:anchorId="631B89BB" id="Rectángulo 44" o:spid="_x0000_s1026" style="position:absolute;margin-left:26.1pt;margin-top:76.95pt;width:12pt;height:9.05pt;z-index:251854848;visibility:visible;mso-wrap-style:square;mso-width-percent:0;mso-height-percent:0;mso-wrap-distance-left:9pt;mso-wrap-distance-top:0;mso-wrap-distance-right:9pt;mso-wrap-distance-bottom:0;mso-position-horizontal:absolute;mso-position-horizontal-relative:text;mso-position-vertical:absolute;mso-position-vertical-relative:text;mso-width-percent:0;mso-height-percent:0;mso-width-relative:margin;mso-height-relative:margin;v-text-anchor:middle" o:gfxdata="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" filled="f" strokecolor="red" strokeweight="2.25pt"/>
             </w:pict>
           </mc:Fallback>
         </mc:AlternateContent>
@@ -8045,13 +8095,14 @@
         <w:rPr>
           <w:rFonts w:ascii="Arial" w:hAnsi="Arial" w:cs="Arial"/>
           <w:noProof/>
-          <w:lang w:val="es-MX" w:eastAsia="es-MX"/>
+          <w:sz w:val="24"/>
+          <w:szCs w:val="24"/>
         </w:rPr>
         <w:drawing>
-          <wp:inline distT="0" distB="0" distL="0" distR="0" wp14:anchorId="129CDE6D" wp14:editId="4B433C5F">
-            <wp:extent cx="5400000" cy="2223422"/>
-            <wp:effectExtent l="152400" t="152400" r="328295" b="342265"/>
-            <wp:docPr id="1879922085" name="Picture 1"/>
+          <wp:inline distT="0" distB="0" distL="0" distR="0" wp14:anchorId="7B2E35BE" wp14:editId="0908CEFD">
+            <wp:extent cx="5400000" cy="2088391"/>
+            <wp:effectExtent l="152400" t="152400" r="328295" b="337820"/>
+            <wp:docPr id="1729625109" name="Picture 1"/>
             <wp:cNvGraphicFramePr>
               <a:graphicFrameLocks xmlns:a="http://schemas.openxmlformats.org/drawingml/2006/main" noChangeAspect="1"/>
             </wp:cNvGraphicFramePr>
@@ -8059,11 +8110,11 @@
               <a:graphicData uri="http://schemas.openxmlformats.org/drawingml/2006/picture">
                 <pic:pic xmlns:pic="http://schemas.openxmlformats.org/drawingml/2006/picture">
                   <pic:nvPicPr>
-                    <pic:cNvPr id="547273814" name="Picture 547273814"/>
+                    <pic:cNvPr id="1060398144" name="Picture 1060398144"/>
                     <pic:cNvPicPr/>
                   </pic:nvPicPr>
                   <pic:blipFill>
-                    <a:blip r:embed="rId11" cstate="print">
+                    <a:blip r:embed="rId18" cstate="print">
                       <a:extLst>
                         <a:ext uri="{28A0092B-C50C-407E-A947-70E740481C1C}">
                           <a14:useLocalDpi xmlns:a14="http://schemas.microsoft.com/office/drawing/2010/main" val="0"/>
@@ -8077,7 +8128,7 @@
                   <pic:spPr>
                     <a:xfrm>
                       <a:off x="0" y="0"/>
-                      <a:ext cx="5400000" cy="2223422"/>
+                      <a:ext cx="5400000" cy="2088391"/>
                     </a:xfrm>
                     <a:prstGeom prst="rect">
                       <a:avLst/>
@@ -8165,41 +8216,95 @@
           <w:sz w:val="24"/>
           <w:szCs w:val="24"/>
         </w:rPr>
-        <w:t>• Cancelar: Permite cancelar el proceso y redirige al usuario a la pantalla principal sin realizar ningún cambio en los datos ni en la tabla de peticiones.</w:t>
-      </w:r>
-    </w:p>
-    <w:p>
-      <w:pPr>
-        <w:rPr>
-          <w:rFonts w:ascii="Arial" w:hAnsi="Arial" w:cs="Arial"/>
-          <w:sz w:val="24"/>
-          <w:szCs w:val="24"/>
-        </w:rPr>
-      </w:pPr>
-      <w:r>
-        <w:rPr>
-          <w:rFonts w:ascii="Arial" w:hAnsi="Arial" w:cs="Arial"/>
-          <w:sz w:val="24"/>
-          <w:szCs w:val="24"/>
-        </w:rPr>
-        <w:t>• Devolver: Retorna la petición al usuario que la capturó en caso de que contenga errores, para su corrección.</w:t>
-      </w:r>
-    </w:p>
-    <w:p>
-      <w:pPr>
-        <w:rPr>
-          <w:rFonts w:ascii="Arial" w:hAnsi="Arial" w:cs="Arial"/>
-          <w:sz w:val="24"/>
-          <w:szCs w:val="24"/>
-        </w:rPr>
-      </w:pPr>
-      <w:r>
-        <w:rPr>
-          <w:rFonts w:ascii="Arial" w:hAnsi="Arial" w:cs="Arial"/>
-          <w:sz w:val="24"/>
-          <w:szCs w:val="24"/>
-        </w:rPr>
-        <w:t xml:space="preserve">• Publicar: Guarda los cambios, actualiza el estatus de la petición y se publican los </w:t>
+        <w:t xml:space="preserve">• </w:t>
+      </w:r>
+      <w:r>
+        <w:rPr>
+          <w:rFonts w:ascii="Arial" w:hAnsi="Arial" w:cs="Arial"/>
+          <w:b/>
+          <w:bCs/>
+          <w:sz w:val="24"/>
+          <w:szCs w:val="24"/>
+        </w:rPr>
+        <w:t>Cancelar</w:t>
+      </w:r>
+      <w:r>
+        <w:rPr>
+          <w:rFonts w:ascii="Arial" w:hAnsi="Arial" w:cs="Arial"/>
+          <w:sz w:val="24"/>
+          <w:szCs w:val="24"/>
+        </w:rPr>
+        <w:t>: Permite cancelar el proceso y redirige al usuario a la pantalla principal sin realizar ningún cambio en los datos ni en la tabla de peticiones.</w:t>
+      </w:r>
+    </w:p>
+    <w:p>
+      <w:pPr>
+        <w:rPr>
+          <w:rFonts w:ascii="Arial" w:hAnsi="Arial" w:cs="Arial"/>
+          <w:sz w:val="24"/>
+          <w:szCs w:val="24"/>
+        </w:rPr>
+      </w:pPr>
+      <w:r>
+        <w:rPr>
+          <w:rFonts w:ascii="Arial" w:hAnsi="Arial" w:cs="Arial"/>
+          <w:sz w:val="24"/>
+          <w:szCs w:val="24"/>
+        </w:rPr>
+        <w:t xml:space="preserve">• </w:t>
+      </w:r>
+      <w:r>
+        <w:rPr>
+          <w:rFonts w:ascii="Arial" w:hAnsi="Arial" w:cs="Arial"/>
+          <w:b/>
+          <w:bCs/>
+          <w:sz w:val="24"/>
+          <w:szCs w:val="24"/>
+        </w:rPr>
+        <w:t>Devolver</w:t>
+      </w:r>
+      <w:r>
+        <w:rPr>
+          <w:rFonts w:ascii="Arial" w:hAnsi="Arial" w:cs="Arial"/>
+          <w:sz w:val="24"/>
+          <w:szCs w:val="24"/>
+        </w:rPr>
+        <w:t>: Retorna la petición al usuario que la capturó en caso de que contenga errores, para su corrección.</w:t>
+      </w:r>
+    </w:p>
+    <w:p>
+      <w:pPr>
+        <w:rPr>
+          <w:rFonts w:ascii="Arial" w:hAnsi="Arial" w:cs="Arial"/>
+          <w:sz w:val="24"/>
+          <w:szCs w:val="24"/>
+        </w:rPr>
+      </w:pPr>
+      <w:r>
+        <w:rPr>
+          <w:rFonts w:ascii="Arial" w:hAnsi="Arial" w:cs="Arial"/>
+          <w:sz w:val="24"/>
+          <w:szCs w:val="24"/>
+        </w:rPr>
+        <w:t xml:space="preserve">• </w:t>
+      </w:r>
+      <w:r>
+        <w:rPr>
+          <w:rFonts w:ascii="Arial" w:hAnsi="Arial" w:cs="Arial"/>
+          <w:b/>
+          <w:bCs/>
+          <w:sz w:val="24"/>
+          <w:szCs w:val="24"/>
+        </w:rPr>
+        <w:t>Publicar</w:t>
+      </w:r>
+      <w:r>
+        <w:rPr>
+          <w:rFonts w:ascii="Arial" w:hAnsi="Arial" w:cs="Arial"/>
+          <w:sz w:val="24"/>
+          <w:szCs w:val="24"/>
+        </w:rPr>
+        <w:t xml:space="preserve">: Guarda los cambios, actualiza el estatus de la petición y se publican los </w:t>
       </w:r>
       <w:r>
         <w:rPr>
@@ -8445,7 +8550,7 @@
           <w:szCs w:val="24"/>
         </w:rPr>
         <w:drawing>
-          <wp:inline distT="0" distB="0" distL="0" distR="0" wp14:anchorId="7448FEAD" wp14:editId="571B844C">
+          <wp:inline distT="0" distB="0" distL="0" distR="0" wp14:anchorId="7448FEAD" wp14:editId="684C6449">
             <wp:extent cx="5612130" cy="2066925"/>
             <wp:effectExtent l="0" t="0" r="1270" b="3175"/>
             <wp:docPr id="1978040233" name="Picture 4"/>
@@ -8460,7 +8565,7 @@
                     <pic:cNvPicPr/>
                   </pic:nvPicPr>
                   <pic:blipFill>
-                    <a:blip r:embed="rId18" cstate="print">
+                    <a:blip r:embed="rId19" cstate="print">
                       <a:extLst>
                         <a:ext uri="{28A0092B-C50C-407E-A947-70E740481C1C}">
                           <a14:useLocalDpi xmlns:a14="http://schemas.microsoft.com/office/drawing/2010/main" val="0"/>
@@ -8506,6 +8611,17 @@
     </w:p>
     <w:p>
       <w:pPr>
+        <w:rPr>
+          <w:rFonts w:ascii="Arial" w:hAnsi="Arial" w:cs="Arial"/>
+          <w:sz w:val="24"/>
+          <w:szCs w:val="24"/>
+        </w:rPr>
+      </w:pPr>
+      <w:bookmarkStart w:id="20" w:name="_Toc123565165"/>
+      <w:bookmarkStart w:id="21" w:name="_Toc124341673"/>
+    </w:p>
+    <w:p>
+      <w:pPr>
         <w:pStyle w:val="Heading1"/>
         <w:spacing w:line="276" w:lineRule="auto"/>
         <w:jc w:val="center"/>
@@ -8515,21 +8631,817 @@
           <w:color w:val="auto"/>
         </w:rPr>
       </w:pPr>
-      <w:bookmarkStart w:id="20" w:name="_Toc123565165"/>
-      <w:bookmarkStart w:id="21" w:name="_Toc124341673"/>
-      <w:bookmarkStart w:id="22" w:name="_Toc200103435"/>
+      <w:bookmarkStart w:id="22" w:name="_Toc211942413"/>
+      <w:bookmarkStart w:id="23" w:name="_Toc213340177"/>
+      <w:bookmarkStart w:id="24" w:name="_Toc214383643"/>
       <w:r>
         <w:rPr>
           <w:rFonts w:cs="Arial"/>
           <w:b w:val="0"/>
           <w:color w:val="auto"/>
         </w:rPr>
-        <w:lastRenderedPageBreak/>
-        <w:t>5.- Consulta de estatus</w:t>
+        <w:t>5</w:t>
+      </w:r>
+      <w:r>
+        <w:rPr>
+          <w:rFonts w:cs="Arial"/>
+          <w:b w:val="0"/>
+          <w:color w:val="auto"/>
+        </w:rPr>
+        <w:t xml:space="preserve">.- </w:t>
+      </w:r>
+      <w:r>
+        <w:rPr>
+          <w:rFonts w:cs="Arial"/>
+          <w:b w:val="0"/>
+          <w:color w:val="auto"/>
+        </w:rPr>
+        <w:t>Para eliminar los datos registrados</w:t>
+      </w:r>
+      <w:bookmarkEnd w:id="22"/>
+      <w:r>
+        <w:rPr>
+          <w:rFonts w:cs="Arial"/>
+          <w:b w:val="0"/>
+          <w:color w:val="auto"/>
+        </w:rPr>
+        <w:t xml:space="preserve"> </w:t>
+      </w:r>
+      <w:r>
+        <w:rPr>
+          <w:rFonts w:cs="Arial"/>
+          <w:b w:val="0"/>
+          <w:color w:val="auto"/>
+        </w:rPr>
+        <w:t xml:space="preserve">de </w:t>
+      </w:r>
+      <w:r>
+        <w:rPr>
+          <w:rFonts w:cs="Arial"/>
+          <w:b w:val="0"/>
+          <w:color w:val="auto"/>
+        </w:rPr>
+        <w:t>Aportaciones</w:t>
+      </w:r>
+      <w:r>
+        <w:rPr>
+          <w:rFonts w:cs="Arial"/>
+          <w:b w:val="0"/>
+          <w:color w:val="auto"/>
+        </w:rPr>
+        <w:t xml:space="preserve"> </w:t>
+      </w:r>
+      <w:r>
+        <w:rPr>
+          <w:rFonts w:cs="Arial"/>
+          <w:b w:val="0"/>
+          <w:color w:val="auto"/>
+        </w:rPr>
+        <w:t>Estatales</w:t>
+      </w:r>
+      <w:r>
+        <w:rPr>
+          <w:rFonts w:cs="Arial"/>
+          <w:b w:val="0"/>
+          <w:color w:val="auto"/>
+        </w:rPr>
+        <w:t xml:space="preserve"> </w:t>
+      </w:r>
+      <w:r>
+        <w:rPr>
+          <w:rFonts w:cs="Arial"/>
+          <w:b w:val="0"/>
+          <w:color w:val="auto"/>
+        </w:rPr>
+        <w:t>–</w:t>
+      </w:r>
+      <w:r>
+        <w:rPr>
+          <w:rFonts w:cs="Arial"/>
+          <w:b w:val="0"/>
+          <w:color w:val="auto"/>
+        </w:rPr>
+        <w:t xml:space="preserve"> M</w:t>
+      </w:r>
+      <w:bookmarkEnd w:id="23"/>
+      <w:r>
+        <w:rPr>
+          <w:rFonts w:cs="Arial"/>
+          <w:b w:val="0"/>
+          <w:color w:val="auto"/>
+        </w:rPr>
+        <w:t>emorias de Cálculo</w:t>
+      </w:r>
+      <w:bookmarkEnd w:id="24"/>
+    </w:p>
+    <w:p>
+      <w:pPr>
+        <w:rPr>
+          <w:rFonts w:ascii="Arial" w:hAnsi="Arial" w:cs="Arial"/>
+          <w:sz w:val="24"/>
+          <w:szCs w:val="24"/>
+        </w:rPr>
+      </w:pPr>
+    </w:p>
+    <w:p>
+      <w:pPr>
+        <w:rPr>
+          <w:rFonts w:ascii="Arial" w:hAnsi="Arial" w:cs="Arial"/>
+          <w:sz w:val="24"/>
+          <w:szCs w:val="24"/>
+        </w:rPr>
+      </w:pPr>
+      <w:r>
+        <w:rPr>
+          <w:rFonts w:ascii="Arial" w:hAnsi="Arial" w:cs="Arial"/>
+          <w:sz w:val="24"/>
+          <w:szCs w:val="24"/>
+        </w:rPr>
+        <w:t>5</w:t>
+      </w:r>
+      <w:r>
+        <w:rPr>
+          <w:rFonts w:ascii="Arial" w:hAnsi="Arial" w:cs="Arial"/>
+          <w:sz w:val="24"/>
+          <w:szCs w:val="24"/>
+        </w:rPr>
+        <w:t xml:space="preserve">.1.- Para </w:t>
+      </w:r>
+      <w:r>
+        <w:rPr>
+          <w:rFonts w:ascii="Arial" w:hAnsi="Arial" w:cs="Arial"/>
+          <w:sz w:val="24"/>
+          <w:szCs w:val="24"/>
+        </w:rPr>
+        <w:t>eliminar</w:t>
+      </w:r>
+      <w:r>
+        <w:rPr>
+          <w:rFonts w:ascii="Arial" w:hAnsi="Arial" w:cs="Arial"/>
+          <w:sz w:val="24"/>
+          <w:szCs w:val="24"/>
+        </w:rPr>
+        <w:t xml:space="preserve"> los detalles de</w:t>
+      </w:r>
+      <w:r>
+        <w:rPr>
+          <w:rFonts w:ascii="Arial" w:hAnsi="Arial" w:cs="Arial"/>
+          <w:sz w:val="24"/>
+          <w:szCs w:val="24"/>
+        </w:rPr>
+        <w:t xml:space="preserve"> </w:t>
+      </w:r>
+      <w:r>
+        <w:rPr>
+          <w:rFonts w:ascii="Arial" w:hAnsi="Arial" w:cs="Arial"/>
+          <w:sz w:val="24"/>
+          <w:szCs w:val="24"/>
+        </w:rPr>
+        <w:t>l</w:t>
+      </w:r>
+      <w:r>
+        <w:rPr>
+          <w:rFonts w:ascii="Arial" w:hAnsi="Arial" w:cs="Arial"/>
+          <w:sz w:val="24"/>
+          <w:szCs w:val="24"/>
+        </w:rPr>
+        <w:t>a</w:t>
+      </w:r>
+      <w:r>
+        <w:rPr>
+          <w:rFonts w:ascii="Arial" w:hAnsi="Arial" w:cs="Arial"/>
+          <w:sz w:val="24"/>
+          <w:szCs w:val="24"/>
+        </w:rPr>
+        <w:t xml:space="preserve"> </w:t>
+      </w:r>
+      <w:r>
+        <w:rPr>
+          <w:rFonts w:ascii="Arial" w:hAnsi="Arial" w:cs="Arial"/>
+          <w:sz w:val="24"/>
+          <w:szCs w:val="24"/>
+        </w:rPr>
+        <w:t xml:space="preserve">información de </w:t>
+      </w:r>
+      <w:r>
+        <w:rPr>
+          <w:rFonts w:ascii="Arial" w:hAnsi="Arial" w:cs="Arial"/>
+          <w:sz w:val="24"/>
+          <w:szCs w:val="24"/>
+        </w:rPr>
+        <w:t>Aportaciones</w:t>
+      </w:r>
+      <w:r>
+        <w:rPr>
+          <w:rFonts w:ascii="Arial" w:hAnsi="Arial" w:cs="Arial"/>
+          <w:sz w:val="24"/>
+          <w:szCs w:val="24"/>
+        </w:rPr>
+        <w:t xml:space="preserve"> </w:t>
+      </w:r>
+      <w:r>
+        <w:rPr>
+          <w:rFonts w:ascii="Arial" w:hAnsi="Arial" w:cs="Arial"/>
+          <w:sz w:val="24"/>
+          <w:szCs w:val="24"/>
+        </w:rPr>
+        <w:t>Estatales</w:t>
+      </w:r>
+      <w:r>
+        <w:rPr>
+          <w:rFonts w:ascii="Arial" w:hAnsi="Arial" w:cs="Arial"/>
+          <w:sz w:val="24"/>
+          <w:szCs w:val="24"/>
+        </w:rPr>
+        <w:t xml:space="preserve"> </w:t>
+      </w:r>
+      <w:r>
+        <w:rPr>
+          <w:rFonts w:ascii="Arial" w:hAnsi="Arial" w:cs="Arial"/>
+          <w:sz w:val="24"/>
+          <w:szCs w:val="24"/>
+        </w:rPr>
+        <w:t>–</w:t>
+      </w:r>
+      <w:r>
+        <w:rPr>
+          <w:rFonts w:ascii="Arial" w:hAnsi="Arial" w:cs="Arial"/>
+          <w:sz w:val="24"/>
+          <w:szCs w:val="24"/>
+        </w:rPr>
+        <w:t xml:space="preserve"> </w:t>
+      </w:r>
+      <w:r>
+        <w:rPr>
+          <w:rFonts w:ascii="Arial" w:hAnsi="Arial" w:cs="Arial"/>
+          <w:sz w:val="24"/>
+          <w:szCs w:val="24"/>
+        </w:rPr>
+        <w:t>Memorias de Cálculo</w:t>
+      </w:r>
+      <w:r>
+        <w:rPr>
+          <w:rFonts w:ascii="Arial" w:hAnsi="Arial" w:cs="Arial"/>
+          <w:sz w:val="24"/>
+          <w:szCs w:val="24"/>
+        </w:rPr>
+        <w:t xml:space="preserve"> deberá seleccionar el icono de Eliminar   </w:t>
+      </w:r>
+      <w:r>
+        <w:rPr>
+          <w:rFonts w:ascii="Arial" w:hAnsi="Arial" w:cs="Arial"/>
+          <w:noProof/>
+          <w:sz w:val="24"/>
+          <w:szCs w:val="24"/>
+        </w:rPr>
+        <w:drawing>
+          <wp:inline distT="0" distB="0" distL="0" distR="0" wp14:anchorId="29B3241D" wp14:editId="587D3A76">
+            <wp:extent cx="180000" cy="212000"/>
+            <wp:effectExtent l="0" t="0" r="0" b="4445"/>
+            <wp:docPr id="39704351" name="Picture 2"/>
+            <wp:cNvGraphicFramePr>
+              <a:graphicFrameLocks xmlns:a="http://schemas.openxmlformats.org/drawingml/2006/main" noChangeAspect="1"/>
+            </wp:cNvGraphicFramePr>
+            <a:graphic xmlns:a="http://schemas.openxmlformats.org/drawingml/2006/main">
+              <a:graphicData uri="http://schemas.openxmlformats.org/drawingml/2006/picture">
+                <pic:pic xmlns:pic="http://schemas.openxmlformats.org/drawingml/2006/picture">
+                  <pic:nvPicPr>
+                    <pic:cNvPr id="39704351" name="Picture 39704351"/>
+                    <pic:cNvPicPr/>
+                  </pic:nvPicPr>
+                  <pic:blipFill>
+                    <a:blip r:embed="rId20" cstate="print">
+                      <a:extLst>
+                        <a:ext uri="{28A0092B-C50C-407E-A947-70E740481C1C}">
+                          <a14:useLocalDpi xmlns:a14="http://schemas.microsoft.com/office/drawing/2010/main" val="0"/>
+                        </a:ext>
+                      </a:extLst>
+                    </a:blip>
+                    <a:stretch>
+                      <a:fillRect/>
+                    </a:stretch>
+                  </pic:blipFill>
+                  <pic:spPr>
+                    <a:xfrm>
+                      <a:off x="0" y="0"/>
+                      <a:ext cx="180000" cy="212000"/>
+                    </a:xfrm>
+                    <a:prstGeom prst="rect">
+                      <a:avLst/>
+                    </a:prstGeom>
+                  </pic:spPr>
+                </pic:pic>
+              </a:graphicData>
+            </a:graphic>
+          </wp:inline>
+        </w:drawing>
+      </w:r>
+    </w:p>
+    <w:p>
+      <w:pPr>
+        <w:spacing w:line="276" w:lineRule="auto"/>
+        <w:rPr>
+          <w:rFonts w:ascii="Arial" w:hAnsi="Arial" w:cs="Arial"/>
+          <w:sz w:val="24"/>
+          <w:szCs w:val="24"/>
+        </w:rPr>
+      </w:pPr>
+    </w:p>
+    <w:p>
+      <w:pPr>
+        <w:spacing w:line="276" w:lineRule="auto"/>
+        <w:rPr>
+          <w:rFonts w:ascii="Arial" w:hAnsi="Arial" w:cs="Arial"/>
+          <w:sz w:val="24"/>
+          <w:szCs w:val="24"/>
+          <w:lang w:val="es-MX"/>
+        </w:rPr>
+      </w:pPr>
+    </w:p>
+    <w:p>
+      <w:pPr>
+        <w:spacing w:line="276" w:lineRule="auto"/>
+        <w:rPr>
+          <w:rFonts w:ascii="Arial" w:hAnsi="Arial" w:cs="Arial"/>
+          <w:sz w:val="24"/>
+          <w:szCs w:val="24"/>
+        </w:rPr>
+      </w:pPr>
+      <w:r>
+        <w:rPr>
+          <w:noProof/>
+          <w:lang w:val="es-MX" w:eastAsia="es-MX"/>
+        </w:rPr>
+        <mc:AlternateContent>
+          <mc:Choice Requires="wps">
+            <w:drawing>
+              <wp:anchor distT="0" distB="0" distL="114300" distR="114300" simplePos="0" relativeHeight="251877376" behindDoc="0" locked="0" layoutInCell="1" allowOverlap="1" wp14:anchorId="5738971C" wp14:editId="204E1BE1">
+                <wp:simplePos x="0" y="0"/>
+                <wp:positionH relativeFrom="column">
+                  <wp:posOffset>221615</wp:posOffset>
+                </wp:positionH>
+                <wp:positionV relativeFrom="paragraph">
+                  <wp:posOffset>721360</wp:posOffset>
+                </wp:positionV>
+                <wp:extent cx="132368" cy="140220"/>
+                <wp:effectExtent l="12700" t="12700" r="7620" b="12700"/>
+                <wp:wrapNone/>
+                <wp:docPr id="244479765" name="Rectángulo 36"/>
+                <wp:cNvGraphicFramePr/>
+                <a:graphic xmlns:a="http://schemas.openxmlformats.org/drawingml/2006/main">
+                  <a:graphicData uri="http://schemas.microsoft.com/office/word/2010/wordprocessingShape">
+                    <wps:wsp>
+                      <wps:cNvSpPr/>
+                      <wps:spPr>
+                        <a:xfrm>
+                          <a:off x="0" y="0"/>
+                          <a:ext cx="132368" cy="140220"/>
+                        </a:xfrm>
+                        <a:prstGeom prst="rect">
+                          <a:avLst/>
+                        </a:prstGeom>
+                        <a:noFill/>
+                        <a:ln w="22225">
+                          <a:solidFill>
+                            <a:srgbClr val="FF0000"/>
+                          </a:solidFill>
+                        </a:ln>
+                      </wps:spPr>
+                      <wps:style>
+                        <a:lnRef idx="2">
+                          <a:schemeClr val="accent1">
+                            <a:shade val="50000"/>
+                          </a:schemeClr>
+                        </a:lnRef>
+                        <a:fillRef idx="1">
+                          <a:schemeClr val="accent1"/>
+                        </a:fillRef>
+                        <a:effectRef idx="0">
+                          <a:schemeClr val="accent1"/>
+                        </a:effectRef>
+                        <a:fontRef idx="minor">
+                          <a:schemeClr val="lt1"/>
+                        </a:fontRef>
+                      </wps:style>
+                      <wps:bodyPr rot="0" spcFirstLastPara="0" vertOverflow="overflow" horzOverflow="overflow" vert="horz" wrap="square" lIns="91440" tIns="45720" rIns="91440" bIns="45720" numCol="1" spcCol="0" rtlCol="0" fromWordArt="0" anchor="ctr" anchorCtr="0" forceAA="0" compatLnSpc="1">
+                        <a:prstTxWarp prst="textNoShape">
+                          <a:avLst/>
+                        </a:prstTxWarp>
+                        <a:noAutofit/>
+                      </wps:bodyPr>
+                    </wps:wsp>
+                  </a:graphicData>
+                </a:graphic>
+                <wp14:sizeRelH relativeFrom="margin">
+                  <wp14:pctWidth>0</wp14:pctWidth>
+                </wp14:sizeRelH>
+                <wp14:sizeRelV relativeFrom="margin">
+                  <wp14:pctHeight>0</wp14:pctHeight>
+                </wp14:sizeRelV>
+              </wp:anchor>
+            </w:drawing>
+          </mc:Choice>
+          <mc:Fallback>
+            <w:pict>
+              <v:rect w14:anchorId="1D40072E" id="Rectángulo 36" o:spid="_x0000_s1026" style="position:absolute;margin-left:17.45pt;margin-top:56.8pt;width:10.4pt;height:11.05pt;z-index:251877376;visibility:visible;mso-wrap-style:square;mso-width-percent:0;mso-height-percent:0;mso-wrap-distance-left:9pt;mso-wrap-distance-top:0;mso-wrap-distance-right:9pt;mso-wrap-distance-bottom:0;mso-position-horizontal:absolute;mso-position-horizontal-relative:text;mso-position-vertical:absolute;mso-position-vertical-relative:text;mso-width-percent:0;mso-height-percent:0;mso-width-relative:margin;mso-height-relative:margin;v-text-anchor:middle" o:gfxdata="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" filled="f" strokecolor="red" strokeweight="1.75pt"/>
+            </w:pict>
+          </mc:Fallback>
+        </mc:AlternateContent>
+      </w:r>
+      <w:r>
+        <w:rPr>
+          <w:rFonts w:ascii="Arial" w:hAnsi="Arial" w:cs="Arial"/>
+          <w:noProof/>
+          <w:sz w:val="24"/>
+          <w:szCs w:val="24"/>
+        </w:rPr>
+        <w:drawing>
+          <wp:inline distT="0" distB="0" distL="0" distR="0" wp14:anchorId="092C54E3" wp14:editId="6A2E3088">
+            <wp:extent cx="5400000" cy="2088391"/>
+            <wp:effectExtent l="152400" t="152400" r="328295" b="337820"/>
+            <wp:docPr id="1060398144" name="Picture 1"/>
+            <wp:cNvGraphicFramePr>
+              <a:graphicFrameLocks xmlns:a="http://schemas.openxmlformats.org/drawingml/2006/main" noChangeAspect="1"/>
+            </wp:cNvGraphicFramePr>
+            <a:graphic xmlns:a="http://schemas.openxmlformats.org/drawingml/2006/main">
+              <a:graphicData uri="http://schemas.openxmlformats.org/drawingml/2006/picture">
+                <pic:pic xmlns:pic="http://schemas.openxmlformats.org/drawingml/2006/picture">
+                  <pic:nvPicPr>
+                    <pic:cNvPr id="1060398144" name="Picture 1060398144"/>
+                    <pic:cNvPicPr/>
+                  </pic:nvPicPr>
+                  <pic:blipFill>
+                    <a:blip r:embed="rId18" cstate="print">
+                      <a:extLst>
+                        <a:ext uri="{28A0092B-C50C-407E-A947-70E740481C1C}">
+                          <a14:useLocalDpi xmlns:a14="http://schemas.microsoft.com/office/drawing/2010/main" val="0"/>
+                        </a:ext>
+                      </a:extLst>
+                    </a:blip>
+                    <a:stretch>
+                      <a:fillRect/>
+                    </a:stretch>
+                  </pic:blipFill>
+                  <pic:spPr>
+                    <a:xfrm>
+                      <a:off x="0" y="0"/>
+                      <a:ext cx="5400000" cy="2088391"/>
+                    </a:xfrm>
+                    <a:prstGeom prst="rect">
+                      <a:avLst/>
+                    </a:prstGeom>
+                    <a:effectLst>
+                      <a:outerShdw blurRad="292100" dist="139700" dir="2700000" algn="ctr" rotWithShape="0">
+                        <a:srgbClr val="000000">
+                          <a:alpha val="65000"/>
+                        </a:srgbClr>
+                      </a:outerShdw>
+                    </a:effectLst>
+                  </pic:spPr>
+                </pic:pic>
+              </a:graphicData>
+            </a:graphic>
+          </wp:inline>
+        </w:drawing>
+      </w:r>
+    </w:p>
+    <w:p>
+      <w:pPr>
+        <w:rPr>
+          <w:rFonts w:ascii="Arial" w:hAnsi="Arial" w:cs="Arial"/>
+          <w:sz w:val="24"/>
+          <w:szCs w:val="24"/>
+        </w:rPr>
+      </w:pPr>
+      <w:r>
+        <w:rPr>
+          <w:rFonts w:ascii="Arial" w:hAnsi="Arial" w:cs="Arial"/>
+          <w:sz w:val="24"/>
+          <w:szCs w:val="24"/>
+        </w:rPr>
+        <w:br w:type="page"/>
+      </w:r>
+    </w:p>
+    <w:p>
+      <w:pPr>
+        <w:spacing w:line="276" w:lineRule="auto"/>
+        <w:rPr>
+          <w:rFonts w:ascii="Arial" w:hAnsi="Arial" w:cs="Arial"/>
+          <w:sz w:val="24"/>
+          <w:szCs w:val="24"/>
+        </w:rPr>
+      </w:pPr>
+    </w:p>
+    <w:p>
+      <w:pPr>
+        <w:spacing w:line="276" w:lineRule="auto"/>
+        <w:rPr>
+          <w:rFonts w:ascii="Arial" w:hAnsi="Arial" w:cs="Arial"/>
+          <w:sz w:val="24"/>
+          <w:szCs w:val="24"/>
+        </w:rPr>
+      </w:pPr>
+      <w:r>
+        <w:rPr>
+          <w:rFonts w:ascii="Arial" w:hAnsi="Arial" w:cs="Arial"/>
+          <w:sz w:val="24"/>
+          <w:szCs w:val="24"/>
+        </w:rPr>
+        <w:t xml:space="preserve">Y deberá confirmar el proceso de Eliminación de un registro de las </w:t>
+      </w:r>
+      <w:r>
+        <w:rPr>
+          <w:rFonts w:ascii="Arial" w:hAnsi="Arial" w:cs="Arial"/>
+          <w:sz w:val="24"/>
+          <w:szCs w:val="24"/>
+        </w:rPr>
+        <w:t>Aportaciones</w:t>
+      </w:r>
+      <w:r>
+        <w:rPr>
+          <w:rFonts w:ascii="Arial" w:hAnsi="Arial" w:cs="Arial"/>
+          <w:sz w:val="24"/>
+          <w:szCs w:val="24"/>
+        </w:rPr>
+        <w:t xml:space="preserve"> </w:t>
+      </w:r>
+      <w:r>
+        <w:rPr>
+          <w:rFonts w:ascii="Arial" w:hAnsi="Arial" w:cs="Arial"/>
+          <w:sz w:val="24"/>
+          <w:szCs w:val="24"/>
+        </w:rPr>
+        <w:t>Estatales</w:t>
+      </w:r>
+      <w:r>
+        <w:rPr>
+          <w:rFonts w:ascii="Arial" w:hAnsi="Arial" w:cs="Arial"/>
+          <w:sz w:val="24"/>
+          <w:szCs w:val="24"/>
+        </w:rPr>
+        <w:t xml:space="preserve"> </w:t>
+      </w:r>
+      <w:r>
+        <w:rPr>
+          <w:rFonts w:ascii="Arial" w:hAnsi="Arial" w:cs="Arial"/>
+          <w:sz w:val="24"/>
+          <w:szCs w:val="24"/>
+        </w:rPr>
+        <w:t>–</w:t>
+      </w:r>
+      <w:r>
+        <w:rPr>
+          <w:rFonts w:ascii="Arial" w:hAnsi="Arial" w:cs="Arial"/>
+          <w:sz w:val="24"/>
+          <w:szCs w:val="24"/>
+        </w:rPr>
+        <w:t xml:space="preserve"> M</w:t>
+      </w:r>
+      <w:r>
+        <w:rPr>
+          <w:rFonts w:ascii="Arial" w:hAnsi="Arial" w:cs="Arial"/>
+          <w:sz w:val="24"/>
+          <w:szCs w:val="24"/>
+        </w:rPr>
+        <w:t>emorias de Cálculos</w:t>
+      </w:r>
+      <w:r>
+        <w:rPr>
+          <w:rFonts w:ascii="Arial" w:hAnsi="Arial" w:cs="Arial"/>
+          <w:sz w:val="24"/>
+          <w:szCs w:val="24"/>
+        </w:rPr>
+        <w:t>.</w:t>
+      </w:r>
+    </w:p>
+    <w:p>
+      <w:pPr>
+        <w:spacing w:line="276" w:lineRule="auto"/>
+        <w:rPr>
+          <w:rFonts w:ascii="Arial" w:hAnsi="Arial" w:cs="Arial"/>
+          <w:sz w:val="24"/>
+          <w:szCs w:val="24"/>
+        </w:rPr>
+      </w:pPr>
+    </w:p>
+    <w:p>
+      <w:pPr>
+        <w:spacing w:line="276" w:lineRule="auto"/>
+        <w:jc w:val="center"/>
+        <w:rPr>
+          <w:rFonts w:ascii="Arial" w:hAnsi="Arial" w:cs="Arial"/>
+          <w:sz w:val="24"/>
+          <w:szCs w:val="24"/>
+        </w:rPr>
+      </w:pPr>
+      <w:r>
+        <w:rPr>
+          <w:noProof/>
+          <w:lang w:val="es-MX" w:eastAsia="es-MX"/>
+        </w:rPr>
+        <mc:AlternateContent>
+          <mc:Choice Requires="wps">
+            <w:drawing>
+              <wp:anchor distT="0" distB="0" distL="114300" distR="114300" simplePos="0" relativeHeight="251878400" behindDoc="0" locked="0" layoutInCell="1" allowOverlap="1" wp14:anchorId="06C10DC2" wp14:editId="37398F10">
+                <wp:simplePos x="0" y="0"/>
+                <wp:positionH relativeFrom="margin">
+                  <wp:posOffset>1848031</wp:posOffset>
+                </wp:positionH>
+                <wp:positionV relativeFrom="paragraph">
+                  <wp:posOffset>2287270</wp:posOffset>
+                </wp:positionV>
+                <wp:extent cx="900000" cy="396000"/>
+                <wp:effectExtent l="12700" t="12700" r="27305" b="23495"/>
+                <wp:wrapNone/>
+                <wp:docPr id="1557520684" name="Rectángulo 34"/>
+                <wp:cNvGraphicFramePr/>
+                <a:graphic xmlns:a="http://schemas.openxmlformats.org/drawingml/2006/main">
+                  <a:graphicData uri="http://schemas.microsoft.com/office/word/2010/wordprocessingShape">
+                    <wps:wsp>
+                      <wps:cNvSpPr/>
+                      <wps:spPr>
+                        <a:xfrm>
+                          <a:off x="0" y="0"/>
+                          <a:ext cx="900000" cy="396000"/>
+                        </a:xfrm>
+                        <a:prstGeom prst="rect">
+                          <a:avLst/>
+                        </a:prstGeom>
+                        <a:noFill/>
+                        <a:ln w="38100">
+                          <a:solidFill>
+                            <a:srgbClr val="FF0000"/>
+                          </a:solidFill>
+                        </a:ln>
+                      </wps:spPr>
+                      <wps:style>
+                        <a:lnRef idx="2">
+                          <a:schemeClr val="accent1">
+                            <a:shade val="50000"/>
+                          </a:schemeClr>
+                        </a:lnRef>
+                        <a:fillRef idx="1">
+                          <a:schemeClr val="accent1"/>
+                        </a:fillRef>
+                        <a:effectRef idx="0">
+                          <a:schemeClr val="accent1"/>
+                        </a:effectRef>
+                        <a:fontRef idx="minor">
+                          <a:schemeClr val="lt1"/>
+                        </a:fontRef>
+                      </wps:style>
+                      <wps:bodyPr rot="0" spcFirstLastPara="0" vertOverflow="overflow" horzOverflow="overflow" vert="horz" wrap="square" lIns="91440" tIns="45720" rIns="91440" bIns="45720" numCol="1" spcCol="0" rtlCol="0" fromWordArt="0" anchor="ctr" anchorCtr="0" forceAA="0" compatLnSpc="1">
+                        <a:prstTxWarp prst="textNoShape">
+                          <a:avLst/>
+                        </a:prstTxWarp>
+                        <a:noAutofit/>
+                      </wps:bodyPr>
+                    </wps:wsp>
+                  </a:graphicData>
+                </a:graphic>
+                <wp14:sizeRelH relativeFrom="margin">
+                  <wp14:pctWidth>0</wp14:pctWidth>
+                </wp14:sizeRelH>
+                <wp14:sizeRelV relativeFrom="margin">
+                  <wp14:pctHeight>0</wp14:pctHeight>
+                </wp14:sizeRelV>
+              </wp:anchor>
+            </w:drawing>
+          </mc:Choice>
+          <mc:Fallback>
+            <w:pict>
+              <v:rect w14:anchorId="4C2C2F1B" id="Rectángulo 34" o:spid="_x0000_s1026" style="position:absolute;margin-left:145.5pt;margin-top:180.1pt;width:70.85pt;height:31.2pt;z-index:251878400;visibility:visible;mso-wrap-style:square;mso-width-percent:0;mso-height-percent:0;mso-wrap-distance-left:9pt;mso-wrap-distance-top:0;mso-wrap-distance-right:9pt;mso-wrap-distance-bottom:0;mso-position-horizontal:absolute;mso-position-horizontal-relative:margin;mso-position-vertical:absolute;mso-position-vertical-relative:text;mso-width-percent:0;mso-height-percent:0;mso-width-relative:margin;mso-height-relative:margin;v-text-anchor:middle" o:gfxdata="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" filled="f" strokecolor="red" strokeweight="3pt">
+                <w10:wrap anchorx="margin"/>
+              </v:rect>
+            </w:pict>
+          </mc:Fallback>
+        </mc:AlternateContent>
+      </w:r>
+      <w:r>
+        <w:rPr>
+          <w:noProof/>
+          <w:lang w:val="es-MX" w:eastAsia="es-MX"/>
+        </w:rPr>
+        <w:drawing>
+          <wp:inline distT="0" distB="0" distL="0" distR="0" wp14:anchorId="36322C82" wp14:editId="3DE24CF2">
+            <wp:extent cx="3822700" cy="2679700"/>
+            <wp:effectExtent l="152400" t="152400" r="330200" b="342900"/>
+            <wp:docPr id="521804190" name="Picture 1"/>
+            <wp:cNvGraphicFramePr>
+              <a:graphicFrameLocks xmlns:a="http://schemas.openxmlformats.org/drawingml/2006/main" noChangeAspect="1"/>
+            </wp:cNvGraphicFramePr>
+            <a:graphic xmlns:a="http://schemas.openxmlformats.org/drawingml/2006/main">
+              <a:graphicData uri="http://schemas.openxmlformats.org/drawingml/2006/picture">
+                <pic:pic xmlns:pic="http://schemas.openxmlformats.org/drawingml/2006/picture">
+                  <pic:nvPicPr>
+                    <pic:cNvPr id="521804190" name="Picture 521804190"/>
+                    <pic:cNvPicPr/>
+                  </pic:nvPicPr>
+                  <pic:blipFill>
+                    <a:blip r:embed="rId21">
+                      <a:extLst>
+                        <a:ext uri="{28A0092B-C50C-407E-A947-70E740481C1C}">
+                          <a14:useLocalDpi xmlns:a14="http://schemas.microsoft.com/office/drawing/2010/main" val="0"/>
+                        </a:ext>
+                      </a:extLst>
+                    </a:blip>
+                    <a:stretch>
+                      <a:fillRect/>
+                    </a:stretch>
+                  </pic:blipFill>
+                  <pic:spPr>
+                    <a:xfrm>
+                      <a:off x="0" y="0"/>
+                      <a:ext cx="3822700" cy="2679700"/>
+                    </a:xfrm>
+                    <a:prstGeom prst="rect">
+                      <a:avLst/>
+                    </a:prstGeom>
+                    <a:effectLst>
+                      <a:outerShdw blurRad="292100" dist="139700" dir="2700000" algn="ctr" rotWithShape="0">
+                        <a:srgbClr val="000000">
+                          <a:alpha val="65000"/>
+                        </a:srgbClr>
+                      </a:outerShdw>
+                    </a:effectLst>
+                  </pic:spPr>
+                </pic:pic>
+              </a:graphicData>
+            </a:graphic>
+          </wp:inline>
+        </w:drawing>
+      </w:r>
+    </w:p>
+    <w:p>
+      <w:pPr>
+        <w:spacing w:line="276" w:lineRule="auto"/>
+        <w:rPr>
+          <w:rFonts w:ascii="Arial" w:hAnsi="Arial" w:cs="Arial"/>
+          <w:sz w:val="24"/>
+          <w:szCs w:val="24"/>
+        </w:rPr>
+      </w:pPr>
+    </w:p>
+    <w:p>
+      <w:pPr>
+        <w:rPr>
+          <w:rFonts w:ascii="Arial" w:hAnsi="Arial" w:cs="Arial"/>
+          <w:sz w:val="24"/>
+          <w:szCs w:val="24"/>
+        </w:rPr>
+      </w:pPr>
+      <w:r>
+        <w:rPr>
+          <w:rFonts w:ascii="Arial" w:hAnsi="Arial" w:cs="Arial"/>
+          <w:sz w:val="24"/>
+          <w:szCs w:val="24"/>
+        </w:rPr>
+        <w:br w:type="page"/>
+      </w:r>
+    </w:p>
+    <w:p>
+      <w:pPr>
+        <w:pStyle w:val="Heading1"/>
+        <w:spacing w:line="276" w:lineRule="auto"/>
+        <w:jc w:val="center"/>
+        <w:rPr>
+          <w:rFonts w:cs="Arial"/>
+          <w:b w:val="0"/>
+          <w:color w:val="auto"/>
+        </w:rPr>
+      </w:pPr>
+    </w:p>
+    <w:p>
+      <w:pPr>
+        <w:pStyle w:val="Heading1"/>
+        <w:spacing w:line="276" w:lineRule="auto"/>
+        <w:jc w:val="center"/>
+        <w:rPr>
+          <w:rFonts w:cs="Arial"/>
+          <w:b w:val="0"/>
+          <w:color w:val="auto"/>
+        </w:rPr>
+      </w:pPr>
+      <w:bookmarkStart w:id="25" w:name="_Toc214383644"/>
+      <w:r>
+        <w:rPr>
+          <w:rFonts w:cs="Arial"/>
+          <w:b w:val="0"/>
+          <w:color w:val="auto"/>
+        </w:rPr>
+        <w:t>6</w:t>
+      </w:r>
+      <w:r>
+        <w:rPr>
+          <w:rFonts w:cs="Arial"/>
+          <w:b w:val="0"/>
+          <w:color w:val="auto"/>
+        </w:rPr>
+        <w:t>.- Consulta de estatus</w:t>
       </w:r>
       <w:bookmarkEnd w:id="20"/>
       <w:bookmarkEnd w:id="21"/>
-      <w:bookmarkEnd w:id="22"/>
+      <w:bookmarkEnd w:id="25"/>
     </w:p>
     <w:p/>
     <w:p>
@@ -8547,7 +9459,15 @@
           <w:sz w:val="24"/>
           <w:szCs w:val="24"/>
         </w:rPr>
-        <w:t>5.1.- El estatus actual del cálculo aparece en la columna final “</w:t>
+        <w:t>6</w:t>
+      </w:r>
+      <w:r>
+        <w:rPr>
+          <w:rFonts w:ascii="Arial" w:hAnsi="Arial" w:cs="Arial"/>
+          <w:sz w:val="24"/>
+          <w:szCs w:val="24"/>
+        </w:rPr>
+        <w:t>.1.- El estatus actual del cálculo aparece en la columna final “</w:t>
       </w:r>
       <w:r>
         <w:rPr>
@@ -8621,7 +9541,7 @@
                     <pic:cNvPicPr/>
                   </pic:nvPicPr>
                   <pic:blipFill>
-                    <a:blip r:embed="rId19"/>
+                    <a:blip r:embed="rId22"/>
                     <a:stretch>
                       <a:fillRect/>
                     </a:stretch>
@@ -8746,7 +9666,7 @@
           <w:lang w:val="es-MX" w:eastAsia="es-MX"/>
         </w:rPr>
         <w:drawing>
-          <wp:inline distT="0" distB="0" distL="0" distR="0" wp14:anchorId="0D5408C5" wp14:editId="4A463270">
+          <wp:inline distT="0" distB="0" distL="0" distR="0" wp14:anchorId="0D5408C5" wp14:editId="3DB1C7D7">
             <wp:extent cx="5400000" cy="2527088"/>
             <wp:effectExtent l="152400" t="152400" r="340995" b="343535"/>
             <wp:docPr id="182859001" name="Picture 2"/>
@@ -8761,7 +9681,7 @@
                     <pic:cNvPicPr/>
                   </pic:nvPicPr>
                   <pic:blipFill>
-                    <a:blip r:embed="rId20" cstate="print">
+                    <a:blip r:embed="rId23" cstate="print">
                       <a:extLst>
                         <a:ext uri="{28A0092B-C50C-407E-A947-70E740481C1C}">
                           <a14:useLocalDpi xmlns:a14="http://schemas.microsoft.com/office/drawing/2010/main" val="0"/>
@@ -8806,8 +9726,8 @@
       </w:pPr>
     </w:p>
     <w:sectPr>
-      <w:headerReference w:type="default" r:id="rId21"/>
-      <w:footerReference w:type="default" r:id="rId22"/>
+      <w:headerReference w:type="default" r:id="rId24"/>
+      <w:footerReference w:type="default" r:id="rId25"/>
       <w:pgSz w:w="12240" w:h="15840" w:code="1"/>
       <w:pgMar w:top="1417" w:right="1701" w:bottom="1417" w:left="1701" w:header="708" w:footer="708" w:gutter="0"/>
       <w:cols w:space="708"/>
@@ -9310,7 +10230,7 @@
         <v:path o:extrusionok="f" gradientshapeok="t" o:connecttype="rect"/>
         <o:lock v:ext="edit" aspectratio="t"/>
       </v:shapetype>
-      <v:shape id="_x0000_i1072" type="#_x0000_t75" style="width:202.1pt;height:65.95pt;visibility:visible;mso-wrap-style:square" o:bullet="t">
+      <v:shape id="_x0000_i1077" type="#_x0000_t75" style="width:202.1pt;height:65.75pt;visibility:visible;mso-wrap-style:square" o:bullet="t">
         <v:imagedata r:id="rId1" o:title=""/>
       </v:shape>
     </w:pict>

</xml_diff>